<commit_message>
refactor(template): update placeholders for 'ketua sidang' in document templates and related logic for improved clarity in signature handling
</commit_message>
<xml_diff>
--- a/template/pROPOSAL/BA proposal TEMPLATE.docx
+++ b/template/pROPOSAL/BA proposal TEMPLATE.docx
@@ -110,29 +110,16 @@
                 <w:szCs w:val="23"/>
               </w:rPr>
             </w:pPr>
-            <w:proofErr w:type="spellStart"/>
-            <w:r>
-              <w:rPr>
-                <w:rFonts w:ascii="Cambria" w:hAnsi="Cambria"/>
-                <w:b/>
-                <w:bCs/>
-                <w:color w:val="000000" w:themeColor="text1"/>
-                <w:sz w:val="23"/>
-                <w:szCs w:val="23"/>
-              </w:rPr>
-              <w:t>Judul</w:t>
-            </w:r>
-            <w:proofErr w:type="spellEnd"/>
-            <w:r>
-              <w:rPr>
-                <w:rFonts w:ascii="Cambria" w:hAnsi="Cambria"/>
-                <w:b/>
-                <w:bCs/>
-                <w:color w:val="000000" w:themeColor="text1"/>
-                <w:sz w:val="23"/>
-                <w:szCs w:val="23"/>
-              </w:rPr>
-              <w:t xml:space="preserve"> Proposal </w:t>
+            <w:r>
+              <w:rPr>
+                <w:rFonts w:ascii="Cambria" w:hAnsi="Cambria"/>
+                <w:b/>
+                <w:bCs/>
+                <w:color w:val="000000" w:themeColor="text1"/>
+                <w:sz w:val="23"/>
+                <w:szCs w:val="23"/>
+              </w:rPr>
+              <w:t xml:space="preserve">Judul Proposal </w:t>
             </w:r>
             <w:r>
               <w:rPr>
@@ -219,15 +206,6 @@
               </w:rPr>
               <w:t/>
             </w:r>
-            <w:proofErr w:type="spellStart"/>
-            <w:r>
-              <w:rPr>
-                <w:rFonts w:ascii="Segoe UI" w:hAnsi="Segoe UI" w:cs="Segoe UI"/>
-                <w:color w:val="000000" w:themeColor="text1"/>
-              </w:rPr>
-              <w:t/>
-            </w:r>
-            <w:proofErr w:type="spellEnd"/>
             <w:r>
               <w:rPr>
                 <w:rFonts w:ascii="Segoe UI" w:hAnsi="Segoe UI" w:cs="Segoe UI"/>
@@ -273,31 +251,7 @@
                 <w:sz w:val="23"/>
                 <w:szCs w:val="23"/>
               </w:rPr>
-              <w:t xml:space="preserve">Nama </w:t>
-            </w:r>
-            <w:proofErr w:type="spellStart"/>
-            <w:r>
-              <w:rPr>
-                <w:rFonts w:ascii="Cambria" w:hAnsi="Cambria"/>
-                <w:b/>
-                <w:bCs/>
-                <w:color w:val="000000" w:themeColor="text1"/>
-                <w:sz w:val="23"/>
-                <w:szCs w:val="23"/>
-              </w:rPr>
-              <w:t>Mahasiswa</w:t>
-            </w:r>
-            <w:proofErr w:type="spellEnd"/>
-            <w:r>
-              <w:rPr>
-                <w:rFonts w:ascii="Cambria" w:hAnsi="Cambria"/>
-                <w:b/>
-                <w:bCs/>
-                <w:color w:val="000000" w:themeColor="text1"/>
-                <w:sz w:val="23"/>
-                <w:szCs w:val="23"/>
-              </w:rPr>
-              <w:t xml:space="preserve">       </w:t>
+              <w:t xml:space="preserve">Nama Mahasiswa       </w:t>
             </w:r>
           </w:p>
         </w:tc>
@@ -368,22 +322,6 @@
               </w:rPr>
               <w:t/>
             </w:r>
-            <w:r>
-              <w:rPr>
-                <w:rFonts w:ascii="Segoe UI" w:hAnsi="Segoe UI" w:cs="Segoe UI"/>
-                <w:color w:val="000000" w:themeColor="text1"/>
-              </w:rPr>
-              <w:t xml:space="preserve"/>
-            </w:r>
-            <w:proofErr w:type="spellStart"/>
-            <w:r>
-              <w:rPr>
-                <w:rFonts w:ascii="Segoe UI" w:hAnsi="Segoe UI" w:cs="Segoe UI"/>
-                <w:color w:val="000000" w:themeColor="text1"/>
-              </w:rPr>
-              <w:t/>
-            </w:r>
-            <w:proofErr w:type="spellEnd"/>
             <w:r>
               <w:rPr>
                 <w:rFonts w:ascii="Segoe UI" w:hAnsi="Segoe UI" w:cs="Segoe UI"/>
@@ -486,31 +424,7 @@
                 <w:sz w:val="23"/>
                 <w:szCs w:val="23"/>
               </w:rPr>
-              <w:t xml:space="preserve">Nama </w:t>
-            </w:r>
-            <w:proofErr w:type="spellStart"/>
-            <w:r>
-              <w:rPr>
-                <w:rFonts w:ascii="Cambria" w:hAnsi="Cambria"/>
-                <w:b/>
-                <w:bCs/>
-                <w:color w:val="000000" w:themeColor="text1"/>
-                <w:sz w:val="23"/>
-                <w:szCs w:val="23"/>
-              </w:rPr>
-              <w:t>Pembimbing</w:t>
-            </w:r>
-            <w:proofErr w:type="spellEnd"/>
-            <w:r>
-              <w:rPr>
-                <w:rFonts w:ascii="Cambria" w:hAnsi="Cambria"/>
-                <w:b/>
-                <w:bCs/>
-                <w:color w:val="000000" w:themeColor="text1"/>
-                <w:sz w:val="23"/>
-                <w:szCs w:val="23"/>
-              </w:rPr>
-              <w:t xml:space="preserve">         </w:t>
+              <w:t xml:space="preserve">Nama Pembimbing         </w:t>
             </w:r>
           </w:p>
         </w:tc>
@@ -571,38 +485,6 @@
               </w:rPr>
               <w:t>${nama_ketua_pembimbing}</w:t>
             </w:r>
-            <w:r>
-              <w:rPr>
-                <w:rFonts w:ascii="Segoe UI" w:hAnsi="Segoe UI" w:cs="Segoe UI"/>
-                <w:color w:val="000000" w:themeColor="text1"/>
-              </w:rPr>
-              <w:t xml:space="preserve"/>
-            </w:r>
-            <w:proofErr w:type="spellStart"/>
-            <w:r>
-              <w:rPr>
-                <w:rFonts w:ascii="Segoe UI" w:hAnsi="Segoe UI" w:cs="Segoe UI"/>
-                <w:color w:val="000000" w:themeColor="text1"/>
-              </w:rPr>
-              <w:t/>
-            </w:r>
-            <w:proofErr w:type="spellEnd"/>
-            <w:r>
-              <w:rPr>
-                <w:rFonts w:ascii="Segoe UI" w:hAnsi="Segoe UI" w:cs="Segoe UI"/>
-                <w:color w:val="000000" w:themeColor="text1"/>
-              </w:rPr>
-              <w:t xml:space="preserve"/>
-            </w:r>
-            <w:proofErr w:type="spellStart"/>
-            <w:r>
-              <w:rPr>
-                <w:rFonts w:ascii="Segoe UI" w:hAnsi="Segoe UI" w:cs="Segoe UI"/>
-                <w:color w:val="000000" w:themeColor="text1"/>
-              </w:rPr>
-              <w:t/>
-            </w:r>
-            <w:proofErr w:type="spellEnd"/>
             <w:r>
               <w:rPr>
                 <w:rFonts w:ascii="Segoe UI" w:hAnsi="Segoe UI" w:cs="Segoe UI"/>
@@ -648,55 +530,7 @@
                 <w:sz w:val="23"/>
                 <w:szCs w:val="23"/>
               </w:rPr>
-              <w:t xml:space="preserve">Nama </w:t>
-            </w:r>
-            <w:proofErr w:type="spellStart"/>
-            <w:r>
-              <w:rPr>
-                <w:rFonts w:ascii="Cambria" w:hAnsi="Cambria"/>
-                <w:b/>
-                <w:bCs/>
-                <w:color w:val="000000" w:themeColor="text1"/>
-                <w:sz w:val="23"/>
-                <w:szCs w:val="23"/>
-              </w:rPr>
-              <w:t>Anggota</w:t>
-            </w:r>
-            <w:proofErr w:type="spellEnd"/>
-            <w:r>
-              <w:rPr>
-                <w:rFonts w:ascii="Cambria" w:hAnsi="Cambria"/>
-                <w:b/>
-                <w:bCs/>
-                <w:color w:val="000000" w:themeColor="text1"/>
-                <w:sz w:val="23"/>
-                <w:szCs w:val="23"/>
-              </w:rPr>
-              <w:t xml:space="preserve"> </w:t>
-            </w:r>
-            <w:proofErr w:type="spellStart"/>
-            <w:r>
-              <w:rPr>
-                <w:rFonts w:ascii="Cambria" w:hAnsi="Cambria"/>
-                <w:b/>
-                <w:bCs/>
-                <w:color w:val="000000" w:themeColor="text1"/>
-                <w:sz w:val="23"/>
-                <w:szCs w:val="23"/>
-              </w:rPr>
-              <w:t>Pembimbing</w:t>
-            </w:r>
-            <w:proofErr w:type="spellEnd"/>
-            <w:r>
-              <w:rPr>
-                <w:rFonts w:ascii="Cambria" w:hAnsi="Cambria"/>
-                <w:b/>
-                <w:bCs/>
-                <w:color w:val="000000" w:themeColor="text1"/>
-                <w:sz w:val="23"/>
-                <w:szCs w:val="23"/>
-              </w:rPr>
-              <w:t xml:space="preserve"> I</w:t>
+              <w:t>Nama Anggota Pembimbing I</w:t>
             </w:r>
           </w:p>
           <w:p>
@@ -775,23 +609,7 @@
                 <w:rFonts w:ascii="Segoe UI" w:hAnsi="Segoe UI" w:cs="Segoe UI"/>
                 <w:color w:val="000000" w:themeColor="text1"/>
               </w:rPr>
-              <w:t xml:space="preserve"/>
-            </w:r>
-            <w:proofErr w:type="spellStart"/>
-            <w:r>
-              <w:rPr>
-                <w:rFonts w:ascii="Segoe UI" w:hAnsi="Segoe UI" w:cs="Segoe UI"/>
-                <w:color w:val="000000" w:themeColor="text1"/>
-              </w:rPr>
               <w:t/>
-            </w:r>
-            <w:proofErr w:type="spellEnd"/>
-            <w:r>
-              <w:rPr>
-                <w:rFonts w:ascii="Segoe UI" w:hAnsi="Segoe UI" w:cs="Segoe UI"/>
-                <w:color w:val="000000" w:themeColor="text1"/>
-              </w:rPr>
-              <w:t xml:space="preserve"/>
             </w:r>
           </w:p>
         </w:tc>
@@ -831,55 +649,7 @@
                 <w:sz w:val="23"/>
                 <w:szCs w:val="23"/>
               </w:rPr>
-              <w:t xml:space="preserve">Nama </w:t>
-            </w:r>
-            <w:proofErr w:type="spellStart"/>
-            <w:r>
-              <w:rPr>
-                <w:rFonts w:ascii="Cambria" w:hAnsi="Cambria"/>
-                <w:b/>
-                <w:bCs/>
-                <w:color w:val="000000" w:themeColor="text1"/>
-                <w:sz w:val="23"/>
-                <w:szCs w:val="23"/>
-              </w:rPr>
-              <w:t>Anggota</w:t>
-            </w:r>
-            <w:proofErr w:type="spellEnd"/>
-            <w:r>
-              <w:rPr>
-                <w:rFonts w:ascii="Cambria" w:hAnsi="Cambria"/>
-                <w:b/>
-                <w:bCs/>
-                <w:color w:val="000000" w:themeColor="text1"/>
-                <w:sz w:val="23"/>
-                <w:szCs w:val="23"/>
-              </w:rPr>
-              <w:t xml:space="preserve"> </w:t>
-            </w:r>
-            <w:proofErr w:type="spellStart"/>
-            <w:r>
-              <w:rPr>
-                <w:rFonts w:ascii="Cambria" w:hAnsi="Cambria"/>
-                <w:b/>
-                <w:bCs/>
-                <w:color w:val="000000" w:themeColor="text1"/>
-                <w:sz w:val="23"/>
-                <w:szCs w:val="23"/>
-              </w:rPr>
-              <w:t>Pembimbing</w:t>
-            </w:r>
-            <w:proofErr w:type="spellEnd"/>
-            <w:r>
-              <w:rPr>
-                <w:rFonts w:ascii="Cambria" w:hAnsi="Cambria"/>
-                <w:b/>
-                <w:bCs/>
-                <w:color w:val="000000" w:themeColor="text1"/>
-                <w:sz w:val="23"/>
-                <w:szCs w:val="23"/>
-              </w:rPr>
-              <w:t xml:space="preserve"> II</w:t>
+              <w:t>Nama Anggota Pembimbing II</w:t>
             </w:r>
           </w:p>
         </w:tc>
@@ -949,31 +719,7 @@
                 <w:sz w:val="23"/>
                 <w:szCs w:val="23"/>
               </w:rPr>
-              <w:t xml:space="preserve"/>
-            </w:r>
-            <w:proofErr w:type="spellStart"/>
-            <w:r>
-              <w:rPr>
-                <w:rFonts w:ascii="Cambria" w:hAnsi="Cambria"/>
-                <w:b/>
-                <w:bCs/>
-                <w:color w:val="000000" w:themeColor="text1"/>
-                <w:sz w:val="23"/>
-                <w:szCs w:val="23"/>
-              </w:rPr>
               <w:t/>
-            </w:r>
-            <w:proofErr w:type="spellEnd"/>
-            <w:r>
-              <w:rPr>
-                <w:rFonts w:ascii="Cambria" w:hAnsi="Cambria"/>
-                <w:b/>
-                <w:bCs/>
-                <w:color w:val="000000" w:themeColor="text1"/>
-                <w:sz w:val="23"/>
-                <w:szCs w:val="23"/>
-              </w:rPr>
-              <w:t xml:space="preserve"/>
             </w:r>
           </w:p>
         </w:tc>
@@ -1093,261 +839,27 @@
               </w:rPr>
               <w:t>${nilai_rata2_dari_form_penilaian}</w:t>
             </w:r>
-            <w:proofErr w:type="spellStart"/>
-            <w:r>
-              <w:rPr>
-                <w:rFonts w:ascii="Cambria" w:hAnsi="Cambria"/>
-                <w:color w:val="000000" w:themeColor="text1"/>
-              </w:rPr>
-              <w:t/>
-            </w:r>
-            <w:proofErr w:type="spellEnd"/>
-            <w:r>
-              <w:rPr>
-                <w:rFonts w:ascii="Cambria" w:hAnsi="Cambria"/>
-                <w:color w:val="000000" w:themeColor="text1"/>
-              </w:rPr>
-              <w:t xml:space="preserve"/>
-            </w:r>
-            <w:proofErr w:type="spellStart"/>
-            <w:r>
-              <w:rPr>
-                <w:rFonts w:ascii="Cambria" w:hAnsi="Cambria"/>
-                <w:color w:val="000000" w:themeColor="text1"/>
-              </w:rPr>
-              <w:t/>
-            </w:r>
-            <w:proofErr w:type="spellEnd"/>
-            <w:r>
-              <w:rPr>
-                <w:rFonts w:ascii="Cambria" w:hAnsi="Cambria"/>
-                <w:color w:val="000000" w:themeColor="text1"/>
-              </w:rPr>
-              <w:t xml:space="preserve"/>
-            </w:r>
-            <w:proofErr w:type="gramStart"/>
-            <w:r>
-              <w:rPr>
-                <w:rFonts w:ascii="Cambria" w:hAnsi="Cambria"/>
-                <w:color w:val="000000" w:themeColor="text1"/>
-              </w:rPr>
-              <w:t/>
-            </w:r>
-            <w:proofErr w:type="gramEnd"/>
-            <w:r>
-              <w:rPr>
-                <w:rFonts w:ascii="Cambria" w:hAnsi="Cambria"/>
-                <w:color w:val="000000" w:themeColor="text1"/>
-              </w:rPr>
-              <w:t xml:space="preserve"/>
-            </w:r>
-            <w:proofErr w:type="spellStart"/>
-            <w:proofErr w:type="gramStart"/>
-            <w:r>
-              <w:rPr>
-                <w:rFonts w:ascii="Cambria" w:hAnsi="Cambria"/>
-                <w:color w:val="000000" w:themeColor="text1"/>
-              </w:rPr>
-              <w:t/>
-            </w:r>
-            <w:proofErr w:type="spellEnd"/>
-            <w:r>
-              <w:rPr>
-                <w:rFonts w:ascii="Cambria" w:hAnsi="Cambria"/>
-                <w:color w:val="000000" w:themeColor="text1"/>
-              </w:rPr>
-              <w:t/>
-            </w:r>
-            <w:r>
-              <w:rPr>
-                <w:rFonts w:ascii="Cambria" w:hAnsi="Cambria"/>
-                <w:b/>
-                <w:bCs/>
-                <w:color w:val="000000" w:themeColor="text1"/>
-                <w:sz w:val="23"/>
-                <w:szCs w:val="23"/>
-              </w:rPr>
-              <w:t xml:space="preserve">   </w:t>
-            </w:r>
-            <w:proofErr w:type="gramEnd"/>
-            <w:r>
-              <w:rPr>
-                <w:rFonts w:ascii="Cambria" w:hAnsi="Cambria"/>
-                <w:b/>
-                <w:bCs/>
-                <w:color w:val="000000" w:themeColor="text1"/>
-                <w:sz w:val="23"/>
-                <w:szCs w:val="23"/>
-              </w:rPr>
-              <w:t xml:space="preserve">     </w:t>
-            </w:r>
-            <w:proofErr w:type="gramStart"/>
-            <w:r>
-              <w:rPr>
-                <w:rFonts w:ascii="Cambria" w:hAnsi="Cambria"/>
-                <w:b/>
-                <w:bCs/>
-                <w:color w:val="000000" w:themeColor="text1"/>
-                <w:sz w:val="23"/>
-                <w:szCs w:val="23"/>
-              </w:rPr>
-              <w:t xml:space="preserve">   </w:t>
-            </w:r>
-            <w:r>
-              <w:rPr>
-                <w:rFonts w:ascii="Cambria" w:hAnsi="Cambria"/>
-                <w:b/>
-                <w:bCs/>
-                <w:color w:val="000000" w:themeColor="text1"/>
-                <w:sz w:val="23"/>
-                <w:szCs w:val="23"/>
-              </w:rPr>
-              <w:t>(</w:t>
-            </w:r>
-            <w:proofErr w:type="spellStart"/>
-            <w:proofErr w:type="gramEnd"/>
-            <w:r>
-              <w:rPr>
-                <w:rFonts w:ascii="Cambria" w:hAnsi="Cambria"/>
-                <w:b/>
-                <w:bCs/>
-                <w:color w:val="000000" w:themeColor="text1"/>
-                <w:sz w:val="23"/>
-                <w:szCs w:val="23"/>
-              </w:rPr>
-              <w:t>jumlah</w:t>
-            </w:r>
-            <w:proofErr w:type="spellEnd"/>
-            <w:r>
-              <w:rPr>
-                <w:rFonts w:ascii="Cambria" w:hAnsi="Cambria"/>
-                <w:b/>
-                <w:bCs/>
-                <w:color w:val="000000" w:themeColor="text1"/>
-                <w:sz w:val="23"/>
-                <w:szCs w:val="23"/>
-              </w:rPr>
-              <w:t xml:space="preserve"> </w:t>
-            </w:r>
-            <w:proofErr w:type="spellStart"/>
-            <w:r>
-              <w:rPr>
-                <w:rFonts w:ascii="Cambria" w:hAnsi="Cambria"/>
-                <w:b/>
-                <w:bCs/>
-                <w:color w:val="000000" w:themeColor="text1"/>
-                <w:sz w:val="23"/>
-                <w:szCs w:val="23"/>
-              </w:rPr>
-              <w:t>nilai</w:t>
-            </w:r>
-            <w:proofErr w:type="spellEnd"/>
-            <w:r>
-              <w:rPr>
-                <w:rFonts w:ascii="Cambria" w:hAnsi="Cambria"/>
-                <w:b/>
-                <w:bCs/>
-                <w:color w:val="000000" w:themeColor="text1"/>
-                <w:sz w:val="23"/>
-                <w:szCs w:val="23"/>
-              </w:rPr>
-              <w:t xml:space="preserve"> </w:t>
-            </w:r>
-            <w:proofErr w:type="spellStart"/>
-            <w:r>
-              <w:rPr>
-                <w:rFonts w:ascii="Cambria" w:hAnsi="Cambria"/>
-                <w:b/>
-                <w:bCs/>
-                <w:color w:val="000000" w:themeColor="text1"/>
-                <w:sz w:val="23"/>
-                <w:szCs w:val="23"/>
-              </w:rPr>
-              <w:t>dibagi</w:t>
-            </w:r>
-            <w:proofErr w:type="spellEnd"/>
-            <w:r>
-              <w:rPr>
-                <w:rFonts w:ascii="Cambria" w:hAnsi="Cambria"/>
-                <w:b/>
-                <w:bCs/>
-                <w:color w:val="000000" w:themeColor="text1"/>
-                <w:sz w:val="23"/>
-                <w:szCs w:val="23"/>
-              </w:rPr>
-              <w:t xml:space="preserve"> </w:t>
-            </w:r>
-            <w:proofErr w:type="spellStart"/>
-            <w:r>
-              <w:rPr>
-                <w:rFonts w:ascii="Cambria" w:hAnsi="Cambria"/>
-                <w:b/>
-                <w:bCs/>
-                <w:color w:val="000000" w:themeColor="text1"/>
-                <w:sz w:val="23"/>
-                <w:szCs w:val="23"/>
-              </w:rPr>
-              <w:t>dengan</w:t>
-            </w:r>
-            <w:proofErr w:type="spellEnd"/>
-            <w:r>
-              <w:rPr>
-                <w:rFonts w:ascii="Cambria" w:hAnsi="Cambria"/>
-                <w:b/>
-                <w:bCs/>
-                <w:color w:val="000000" w:themeColor="text1"/>
-                <w:sz w:val="23"/>
-                <w:szCs w:val="23"/>
-              </w:rPr>
-              <w:t xml:space="preserve"> </w:t>
-            </w:r>
-            <w:proofErr w:type="spellStart"/>
-            <w:r>
-              <w:rPr>
-                <w:rFonts w:ascii="Cambria" w:hAnsi="Cambria"/>
-                <w:b/>
-                <w:bCs/>
-                <w:color w:val="000000" w:themeColor="text1"/>
-                <w:sz w:val="23"/>
-                <w:szCs w:val="23"/>
-              </w:rPr>
-              <w:t>jumlah</w:t>
-            </w:r>
-            <w:proofErr w:type="spellEnd"/>
-            <w:r>
-              <w:rPr>
-                <w:rFonts w:ascii="Cambria" w:hAnsi="Cambria"/>
-                <w:b/>
-                <w:bCs/>
-                <w:color w:val="000000" w:themeColor="text1"/>
-                <w:sz w:val="23"/>
-                <w:szCs w:val="23"/>
-              </w:rPr>
-              <w:t xml:space="preserve"> semua </w:t>
-            </w:r>
-            <w:proofErr w:type="spellStart"/>
-            <w:r>
-              <w:rPr>
-                <w:rFonts w:ascii="Cambria" w:hAnsi="Cambria"/>
-                <w:b/>
-                <w:bCs/>
-                <w:color w:val="000000" w:themeColor="text1"/>
-                <w:sz w:val="23"/>
-                <w:szCs w:val="23"/>
-              </w:rPr>
-              <w:t>penilai</w:t>
-            </w:r>
-            <w:proofErr w:type="spellEnd"/>
-            <w:r>
-              <w:rPr>
-                <w:rFonts w:ascii="Cambria" w:hAnsi="Cambria"/>
-                <w:b/>
-                <w:bCs/>
-                <w:color w:val="000000" w:themeColor="text1"/>
-                <w:sz w:val="23"/>
-                <w:szCs w:val="23"/>
-              </w:rPr>
-              <w:t>)</w:t>
+            <w:r>
+              <w:rPr>
+                <w:rFonts w:ascii="Cambria" w:hAnsi="Cambria"/>
+                <w:b/>
+                <w:bCs/>
+                <w:color w:val="000000" w:themeColor="text1"/>
+                <w:sz w:val="23"/>
+                <w:szCs w:val="23"/>
+              </w:rPr>
+              <w:t xml:space="preserve">           </w:t>
+            </w:r>
+            <w:r>
+              <w:rPr>
+                <w:rFonts w:ascii="Cambria" w:hAnsi="Cambria"/>
+                <w:b/>
+                <w:bCs/>
+                <w:color w:val="000000" w:themeColor="text1"/>
+                <w:sz w:val="23"/>
+                <w:szCs w:val="23"/>
+              </w:rPr>
+              <w:t>(jumlah nilai dibagi dengan jumlah semua penilai)</w:t>
             </w:r>
           </w:p>
         </w:tc>
@@ -1460,7 +972,6 @@
                 <w:szCs w:val="24"/>
               </w:rPr>
             </w:pPr>
-            <w:proofErr w:type="spellStart"/>
             <w:r>
               <w:rPr>
                 <w:rFonts w:ascii="Cambria" w:hAnsi="Cambria"/>
@@ -1469,31 +980,8 @@
                 <w:sz w:val="24"/>
                 <w:szCs w:val="24"/>
               </w:rPr>
-              <w:t>Komponen</w:t>
-            </w:r>
-            <w:proofErr w:type="spellEnd"/>
-            <w:r>
-              <w:rPr>
-                <w:rFonts w:ascii="Cambria" w:hAnsi="Cambria"/>
-                <w:b/>
-                <w:color w:val="000000" w:themeColor="text1"/>
-                <w:sz w:val="24"/>
-                <w:szCs w:val="24"/>
-              </w:rPr>
-              <w:t xml:space="preserve"> </w:t>
-            </w:r>
-            <w:proofErr w:type="spellStart"/>
-            <w:r>
-              <w:rPr>
-                <w:rFonts w:ascii="Cambria" w:hAnsi="Cambria"/>
-                <w:b/>
-                <w:color w:val="000000" w:themeColor="text1"/>
-                <w:sz w:val="24"/>
-                <w:szCs w:val="24"/>
-              </w:rPr>
-              <w:t>Penilaian</w:t>
-            </w:r>
-            <w:proofErr w:type="spellEnd"/>
+              <w:t>Komponen Penilaian</w:t>
+            </w:r>
           </w:p>
           <w:p>
             <w:pPr>
@@ -1600,7 +1088,6 @@
                 <w:szCs w:val="24"/>
               </w:rPr>
             </w:pPr>
-            <w:proofErr w:type="spellStart"/>
             <w:r>
               <w:rPr>
                 <w:rFonts w:ascii="Cambria" w:hAnsi="Cambria"/>
@@ -1609,18 +1096,7 @@
                 <w:sz w:val="24"/>
                 <w:szCs w:val="24"/>
               </w:rPr>
-              <w:t>Keterangan</w:t>
-            </w:r>
-            <w:proofErr w:type="spellEnd"/>
-            <w:r>
-              <w:rPr>
-                <w:rFonts w:ascii="Cambria" w:hAnsi="Cambria"/>
-                <w:b/>
-                <w:color w:val="000000" w:themeColor="text1"/>
-                <w:sz w:val="24"/>
-                <w:szCs w:val="24"/>
-              </w:rPr>
-              <w:t xml:space="preserve"> </w:t>
+              <w:t xml:space="preserve">Keterangan </w:t>
             </w:r>
           </w:p>
         </w:tc>
@@ -1680,23 +1156,13 @@
                 <w:color w:val="000000" w:themeColor="text1"/>
               </w:rPr>
             </w:pPr>
-            <w:proofErr w:type="spellStart"/>
-            <w:r>
-              <w:rPr>
-                <w:rFonts w:ascii="Cambria" w:hAnsi="Cambria"/>
-                <w:b/>
-                <w:color w:val="000000" w:themeColor="text1"/>
-              </w:rPr>
-              <w:t>Penilai</w:t>
-            </w:r>
-            <w:proofErr w:type="spellEnd"/>
-            <w:r>
-              <w:rPr>
-                <w:rFonts w:ascii="Cambria" w:hAnsi="Cambria"/>
-                <w:b/>
-                <w:color w:val="000000" w:themeColor="text1"/>
-              </w:rPr>
-              <w:t xml:space="preserve"> 1</w:t>
+            <w:r>
+              <w:rPr>
+                <w:rFonts w:ascii="Cambria" w:hAnsi="Cambria"/>
+                <w:b/>
+                <w:color w:val="000000" w:themeColor="text1"/>
+              </w:rPr>
+              <w:t>Penilai 1</w:t>
             </w:r>
           </w:p>
         </w:tc>
@@ -1867,23 +1333,13 @@
                 <w:color w:val="000000" w:themeColor="text1"/>
               </w:rPr>
             </w:pPr>
-            <w:proofErr w:type="spellStart"/>
-            <w:r>
-              <w:rPr>
-                <w:rFonts w:ascii="Cambria" w:hAnsi="Cambria"/>
-                <w:b/>
-                <w:color w:val="000000" w:themeColor="text1"/>
-              </w:rPr>
-              <w:t>Penilai</w:t>
-            </w:r>
-            <w:proofErr w:type="spellEnd"/>
-            <w:r>
-              <w:rPr>
-                <w:rFonts w:ascii="Cambria" w:hAnsi="Cambria"/>
-                <w:b/>
-                <w:color w:val="000000" w:themeColor="text1"/>
-              </w:rPr>
-              <w:t xml:space="preserve"> 2</w:t>
+            <w:r>
+              <w:rPr>
+                <w:rFonts w:ascii="Cambria" w:hAnsi="Cambria"/>
+                <w:b/>
+                <w:color w:val="000000" w:themeColor="text1"/>
+              </w:rPr>
+              <w:t>Penilai 2</w:t>
             </w:r>
           </w:p>
         </w:tc>
@@ -2218,38 +1674,6 @@
               </w:rPr>
               <w:t>${nilai_akhir_rata_rata}</w:t>
             </w:r>
-            <w:proofErr w:type="spellStart"/>
-            <w:r>
-              <w:rPr>
-                <w:rFonts w:ascii="Cambria" w:hAnsi="Cambria"/>
-                <w:color w:val="000000" w:themeColor="text1"/>
-              </w:rPr>
-              <w:t/>
-            </w:r>
-            <w:proofErr w:type="spellEnd"/>
-            <w:r>
-              <w:rPr>
-                <w:rFonts w:ascii="Cambria" w:hAnsi="Cambria"/>
-                <w:color w:val="000000" w:themeColor="text1"/>
-              </w:rPr>
-              <w:t xml:space="preserve"/>
-            </w:r>
-            <w:proofErr w:type="spellStart"/>
-            <w:r>
-              <w:rPr>
-                <w:rFonts w:ascii="Cambria" w:hAnsi="Cambria"/>
-                <w:color w:val="000000" w:themeColor="text1"/>
-              </w:rPr>
-              <w:t/>
-            </w:r>
-            <w:proofErr w:type="spellEnd"/>
-            <w:r>
-              <w:rPr>
-                <w:rFonts w:ascii="Cambria" w:hAnsi="Cambria"/>
-                <w:color w:val="000000" w:themeColor="text1"/>
-              </w:rPr>
-              <w:t xml:space="preserve"/>
-            </w:r>
           </w:p>
         </w:tc>
         <w:tc>
@@ -2345,25 +1769,7 @@
                 <w:b/>
                 <w:color w:val="000000" w:themeColor="text1"/>
               </w:rPr>
-              <w:t>Nilai Akhir (</w:t>
-            </w:r>
-            <w:proofErr w:type="spellStart"/>
-            <w:r>
-              <w:rPr>
-                <w:rFonts w:ascii="Cambria" w:hAnsi="Cambria"/>
-                <w:b/>
-                <w:color w:val="000000" w:themeColor="text1"/>
-              </w:rPr>
-              <w:t>Indeks</w:t>
-            </w:r>
-            <w:proofErr w:type="spellEnd"/>
-            <w:r>
-              <w:rPr>
-                <w:rFonts w:ascii="Cambria" w:hAnsi="Cambria"/>
-                <w:b/>
-                <w:color w:val="000000" w:themeColor="text1"/>
-              </w:rPr>
-              <w:t>)</w:t>
+              <w:t>Nilai Akhir (Indeks)</w:t>
             </w:r>
           </w:p>
         </w:tc>
@@ -2396,54 +1802,6 @@
               </w:rPr>
               <w:t>${nilai_akhir_indeks}</w:t>
             </w:r>
-            <w:proofErr w:type="spellStart"/>
-            <w:r>
-              <w:rPr>
-                <w:rFonts w:ascii="Cambria" w:hAnsi="Cambria"/>
-                <w:color w:val="000000" w:themeColor="text1"/>
-              </w:rPr>
-              <w:t/>
-            </w:r>
-            <w:proofErr w:type="spellEnd"/>
-            <w:r>
-              <w:rPr>
-                <w:rFonts w:ascii="Cambria" w:hAnsi="Cambria"/>
-                <w:color w:val="000000" w:themeColor="text1"/>
-              </w:rPr>
-              <w:t xml:space="preserve"/>
-            </w:r>
-            <w:proofErr w:type="spellStart"/>
-            <w:r>
-              <w:rPr>
-                <w:rFonts w:ascii="Cambria" w:hAnsi="Cambria"/>
-                <w:color w:val="000000" w:themeColor="text1"/>
-              </w:rPr>
-              <w:t/>
-            </w:r>
-            <w:proofErr w:type="spellEnd"/>
-            <w:r>
-              <w:rPr>
-                <w:rFonts w:ascii="Cambria" w:hAnsi="Cambria"/>
-                <w:color w:val="000000" w:themeColor="text1"/>
-              </w:rPr>
-              <w:t xml:space="preserve"/>
-            </w:r>
-            <w:proofErr w:type="spellStart"/>
-            <w:r>
-              <w:rPr>
-                <w:rFonts w:ascii="Cambria" w:hAnsi="Cambria"/>
-                <w:color w:val="000000" w:themeColor="text1"/>
-              </w:rPr>
-              <w:t/>
-            </w:r>
-            <w:proofErr w:type="spellEnd"/>
-            <w:r>
-              <w:rPr>
-                <w:rFonts w:ascii="Cambria" w:hAnsi="Cambria"/>
-                <w:color w:val="000000" w:themeColor="text1"/>
-              </w:rPr>
-              <w:t/>
-            </w:r>
           </w:p>
         </w:tc>
         <w:tc>
@@ -2465,21 +1823,12 @@
                 <w:color w:val="000000" w:themeColor="text1"/>
               </w:rPr>
             </w:pPr>
-            <w:proofErr w:type="spellStart"/>
-            <w:r>
-              <w:rPr>
-                <w:rFonts w:ascii="Cambria" w:hAnsi="Cambria"/>
-                <w:color w:val="000000" w:themeColor="text1"/>
-              </w:rPr>
-              <w:t>Indeks</w:t>
-            </w:r>
-            <w:proofErr w:type="spellEnd"/>
-            <w:r>
-              <w:rPr>
-                <w:rFonts w:ascii="Cambria" w:hAnsi="Cambria"/>
-                <w:color w:val="000000" w:themeColor="text1"/>
-              </w:rPr>
-              <w:t xml:space="preserve">:   </w:t>
+            <w:r>
+              <w:rPr>
+                <w:rFonts w:ascii="Cambria" w:hAnsi="Cambria"/>
+                <w:color w:val="000000" w:themeColor="text1"/>
+              </w:rPr>
+              <w:t xml:space="preserve">Indeks:   </w:t>
             </w:r>
             <w:r>
               <w:rPr>
@@ -2709,7 +2058,6 @@
           <w:szCs w:val="24"/>
         </w:rPr>
       </w:pPr>
-      <w:proofErr w:type="spellStart"/>
       <w:r>
         <w:rPr>
           <w:rFonts w:ascii="Cambria" w:hAnsi="Cambria"/>
@@ -2718,40 +2066,7 @@
           <w:color w:val="000000" w:themeColor="text1"/>
           <w:szCs w:val="24"/>
         </w:rPr>
-        <w:t>Tanggal</w:t>
-      </w:r>
-      <w:proofErr w:type="spellEnd"/>
-      <w:r>
-        <w:rPr>
-          <w:rFonts w:ascii="Cambria" w:hAnsi="Cambria"/>
-          <w:b/>
-          <w:bCs/>
-          <w:color w:val="000000" w:themeColor="text1"/>
-          <w:szCs w:val="24"/>
-        </w:rPr>
-        <w:t xml:space="preserve"> </w:t>
-      </w:r>
-      <w:proofErr w:type="spellStart"/>
-      <w:r>
-        <w:rPr>
-          <w:rFonts w:ascii="Cambria" w:hAnsi="Cambria"/>
-          <w:b/>
-          <w:bCs/>
-          <w:color w:val="000000" w:themeColor="text1"/>
-          <w:szCs w:val="24"/>
-        </w:rPr>
-        <w:t>penilaian</w:t>
-      </w:r>
-      <w:proofErr w:type="spellEnd"/>
-      <w:r>
-        <w:rPr>
-          <w:rFonts w:ascii="Cambria" w:hAnsi="Cambria"/>
-          <w:b/>
-          <w:bCs/>
-          <w:color w:val="000000" w:themeColor="text1"/>
-          <w:szCs w:val="24"/>
-        </w:rPr>
-        <w:t xml:space="preserve">: </w:t>
+        <w:t xml:space="preserve">Tanggal penilaian: </w:t>
       </w:r>
       <w:r>
         <w:rPr>
@@ -2773,34 +2088,6 @@
         </w:rPr>
         <w:t/>
       </w:r>
-      <w:proofErr w:type="spellStart"/>
-      <w:r>
-        <w:rPr>
-          <w:rFonts w:ascii="Cambria" w:hAnsi="Cambria"/>
-          <w:color w:val="000000" w:themeColor="text1"/>
-          <w:szCs w:val="24"/>
-        </w:rPr>
-        <w:t/>
-      </w:r>
-      <w:proofErr w:type="spellEnd"/>
-      <w:r>
-        <w:rPr>
-          <w:rFonts w:ascii="Cambria" w:hAnsi="Cambria"/>
-          <w:color w:val="000000" w:themeColor="text1"/>
-          <w:szCs w:val="24"/>
-        </w:rPr>
-        <w:t xml:space="preserve"/>
-      </w:r>
-      <w:proofErr w:type="spellStart"/>
-      <w:r>
-        <w:rPr>
-          <w:rFonts w:ascii="Cambria" w:hAnsi="Cambria"/>
-          <w:color w:val="000000" w:themeColor="text1"/>
-          <w:szCs w:val="24"/>
-        </w:rPr>
-        <w:t/>
-      </w:r>
-      <w:proofErr w:type="spellEnd"/>
       <w:r>
         <w:rPr>
           <w:rFonts w:ascii="Cambria" w:hAnsi="Cambria"/>
@@ -2912,7 +2199,31 @@
           <w:szCs w:val="24"/>
           <w:lang w:val="fi-FI"/>
         </w:rPr>
-        <w:t>${nama_ketua_pembimbing}</w:t>
+        <w:t>${nama_ketua_sidang}</w:t>
+      </w:r>
+      <w:r>
+        <w:rPr>
+          <w:rFonts w:ascii="Cambria" w:hAnsi="Cambria"/>
+          <w:b/>
+          <w:bCs/>
+          <w:color w:val="000000" w:themeColor="text1"/>
+          <w:sz w:val="20"/>
+          <w:szCs w:val="24"/>
+          <w:lang w:val="fi-FI"/>
+        </w:rPr>
+        <w:t xml:space="preserve"/>
+      </w:r>
+      <w:r>
+        <w:rPr>
+          <w:rFonts w:ascii="Cambria" w:hAnsi="Cambria"/>
+          <w:b/>
+          <w:bCs/>
+          <w:color w:val="000000" w:themeColor="text1"/>
+          <w:sz w:val="20"/>
+          <w:szCs w:val="24"/>
+          <w:lang w:val="fi-FI"/>
+        </w:rPr>
+        <w:t/>
       </w:r>
       <w:r>
         <w:rPr>
@@ -2957,7 +2268,7 @@
           <w:color w:val="000000" w:themeColor="text1"/>
           <w:szCs w:val="24"/>
         </w:rPr>
-        <w:t>${nip_ketua_pembimbing}</w:t>
+        <w:t>${nip_ketua_sidang}</w:t>
       </w:r>
       <w:r>
         <w:rPr>
@@ -2967,34 +2278,18 @@
         </w:rPr>
         <w:t xml:space="preserve"/>
       </w:r>
-      <w:proofErr w:type="spellStart"/>
       <w:r>
         <w:rPr>
           <w:rFonts w:ascii="Cambria" w:hAnsi="Cambria"/>
+          <w:b/>
+          <w:bCs/>
           <w:color w:val="000000" w:themeColor="text1"/>
+          <w:sz w:val="20"/>
           <w:szCs w:val="24"/>
+          <w:lang w:val="fi-FI"/>
         </w:rPr>
         <w:t/>
       </w:r>
-      <w:proofErr w:type="spellEnd"/>
-      <w:r>
-        <w:rPr>
-          <w:rFonts w:ascii="Cambria" w:hAnsi="Cambria"/>
-          <w:color w:val="000000" w:themeColor="text1"/>
-          <w:szCs w:val="24"/>
-        </w:rPr>
-        <w:t xml:space="preserve"/>
-      </w:r>
-      <w:proofErr w:type="spellStart"/>
-      <w:r>
-        <w:rPr>
-          <w:rFonts w:ascii="Cambria" w:hAnsi="Cambria"/>
-          <w:color w:val="000000" w:themeColor="text1"/>
-          <w:szCs w:val="24"/>
-        </w:rPr>
-        <w:t/>
-      </w:r>
-      <w:proofErr w:type="spellEnd"/>
       <w:r>
         <w:rPr>
           <w:rFonts w:ascii="Cambria" w:hAnsi="Cambria"/>

</xml_diff>